<commit_message>
debuging; updating reports; upgrading data tables; added AI in analyst forecast
</commit_message>
<xml_diff>
--- a/code/reports/logReport.docx
+++ b/code/reports/logReport.docx
@@ -41,10 +41,10 @@
           <w:rFonts w:ascii="Times New Roman" w:hAnsi="Times New Roman" w:cs="Times New Roman"/>
           <w:sz w:val="48"/>
           <w:szCs w:val="48"/>
-          <w:lang w:val="en-US"/>
         </w:rPr>
         <w:t xml:space="preserve"> </w:t>
       </w:r>
+      <w:proofErr w:type="gramStart"/>
       <w:r>
         <w:rPr>
           <w:rFonts w:ascii="Times New Roman" w:hAnsi="Times New Roman" w:cs="Times New Roman"/>
@@ -72,6 +72,7 @@
         <w:t>ate</w:t>
       </w:r>
       <w:proofErr w:type="spellEnd"/>
+      <w:proofErr w:type="gramEnd"/>
       <w:r>
         <w:rPr>
           <w:rFonts w:ascii="Times New Roman" w:hAnsi="Times New Roman" w:cs="Times New Roman"/>
@@ -240,697 +241,6 @@
         </w:rPr>
         <w:t xml:space="preserve"> }}</w:t>
       </w:r>
-    </w:p>
-    <w:p>
-      <w:pPr>
-        <w:pStyle w:val="a5"/>
-        <w:rPr>
-          <w:rFonts w:ascii="Times New Roman" w:hAnsi="Times New Roman" w:cs="Times New Roman"/>
-          <w:sz w:val="36"/>
-          <w:szCs w:val="36"/>
-        </w:rPr>
-      </w:pPr>
-    </w:p>
-    <w:tbl>
-      <w:tblPr>
-        <w:tblStyle w:val="TableNormal"/>
-        <w:tblW w:w="11066" w:type="dxa"/>
-        <w:tblInd w:w="-570" w:type="dxa"/>
-        <w:tblBorders>
-          <w:top w:val="single" w:sz="2" w:space="0" w:color="000000"/>
-          <w:left w:val="single" w:sz="2" w:space="0" w:color="000000"/>
-          <w:bottom w:val="single" w:sz="2" w:space="0" w:color="000000"/>
-          <w:right w:val="single" w:sz="2" w:space="0" w:color="000000"/>
-          <w:insideH w:val="single" w:sz="2" w:space="0" w:color="000000"/>
-          <w:insideV w:val="single" w:sz="2" w:space="0" w:color="000000"/>
-        </w:tblBorders>
-        <w:tblLayout w:type="fixed"/>
-        <w:tblLook w:val="04A0" w:firstRow="1" w:lastRow="0" w:firstColumn="1" w:lastColumn="0" w:noHBand="0" w:noVBand="1"/>
-      </w:tblPr>
-      <w:tblGrid>
-        <w:gridCol w:w="567"/>
-        <w:gridCol w:w="1985"/>
-        <w:gridCol w:w="1559"/>
-        <w:gridCol w:w="851"/>
-        <w:gridCol w:w="3260"/>
-        <w:gridCol w:w="1559"/>
-        <w:gridCol w:w="1285"/>
-      </w:tblGrid>
-      <w:tr>
-        <w:trPr>
-          <w:trHeight w:val="1201"/>
-        </w:trPr>
-        <w:tc>
-          <w:tcPr>
-            <w:tcW w:w="567" w:type="dxa"/>
-            <w:tcBorders>
-              <w:top w:val="single" w:sz="2" w:space="0" w:color="000000"/>
-              <w:left w:val="single" w:sz="2" w:space="0" w:color="000000"/>
-              <w:bottom w:val="single" w:sz="2" w:space="0" w:color="000000"/>
-              <w:right w:val="single" w:sz="2" w:space="0" w:color="000000"/>
-            </w:tcBorders>
-            <w:tcMar>
-              <w:top w:w="80" w:type="dxa"/>
-              <w:left w:w="80" w:type="dxa"/>
-              <w:bottom w:w="80" w:type="dxa"/>
-              <w:right w:w="80" w:type="dxa"/>
-            </w:tcMar>
-          </w:tcPr>
-          <w:p>
-            <w:pPr>
-              <w:pStyle w:val="2"/>
-            </w:pPr>
-            <w:r>
-              <w:rPr>
-                <w:rFonts w:eastAsia="Arial Unicode MS" w:cs="Arial Unicode MS"/>
-              </w:rPr>
-              <w:t>№</w:t>
-            </w:r>
-          </w:p>
-        </w:tc>
-        <w:tc>
-          <w:tcPr>
-            <w:tcW w:w="1985" w:type="dxa"/>
-            <w:tcBorders>
-              <w:top w:val="single" w:sz="2" w:space="0" w:color="000000"/>
-              <w:left w:val="single" w:sz="2" w:space="0" w:color="000000"/>
-              <w:bottom w:val="single" w:sz="2" w:space="0" w:color="000000"/>
-              <w:right w:val="single" w:sz="2" w:space="0" w:color="000000"/>
-            </w:tcBorders>
-            <w:tcMar>
-              <w:top w:w="80" w:type="dxa"/>
-              <w:left w:w="80" w:type="dxa"/>
-              <w:bottom w:w="80" w:type="dxa"/>
-              <w:right w:w="80" w:type="dxa"/>
-            </w:tcMar>
-          </w:tcPr>
-          <w:p>
-            <w:pPr>
-              <w:pStyle w:val="2"/>
-            </w:pPr>
-            <w:r>
-              <w:rPr>
-                <w:rFonts w:eastAsia="Arial Unicode MS" w:cs="Arial Unicode MS"/>
-              </w:rPr>
-              <w:t>Название</w:t>
-            </w:r>
-          </w:p>
-        </w:tc>
-        <w:tc>
-          <w:tcPr>
-            <w:tcW w:w="1559" w:type="dxa"/>
-            <w:tcBorders>
-              <w:top w:val="single" w:sz="2" w:space="0" w:color="000000"/>
-              <w:left w:val="single" w:sz="2" w:space="0" w:color="000000"/>
-              <w:bottom w:val="single" w:sz="2" w:space="0" w:color="000000"/>
-              <w:right w:val="single" w:sz="2" w:space="0" w:color="000000"/>
-            </w:tcBorders>
-            <w:tcMar>
-              <w:top w:w="80" w:type="dxa"/>
-              <w:left w:w="80" w:type="dxa"/>
-              <w:bottom w:w="80" w:type="dxa"/>
-              <w:right w:w="80" w:type="dxa"/>
-            </w:tcMar>
-          </w:tcPr>
-          <w:p>
-            <w:pPr>
-              <w:pStyle w:val="2"/>
-            </w:pPr>
-            <w:r>
-              <w:rPr>
-                <w:rFonts w:eastAsia="Arial Unicode MS" w:cs="Arial Unicode MS"/>
-              </w:rPr>
-              <w:t>Тип</w:t>
-            </w:r>
-          </w:p>
-        </w:tc>
-        <w:tc>
-          <w:tcPr>
-            <w:tcW w:w="851" w:type="dxa"/>
-            <w:tcBorders>
-              <w:top w:val="single" w:sz="2" w:space="0" w:color="000000"/>
-              <w:left w:val="single" w:sz="2" w:space="0" w:color="000000"/>
-              <w:bottom w:val="single" w:sz="2" w:space="0" w:color="000000"/>
-              <w:right w:val="single" w:sz="2" w:space="0" w:color="000000"/>
-            </w:tcBorders>
-            <w:tcMar>
-              <w:top w:w="80" w:type="dxa"/>
-              <w:left w:w="80" w:type="dxa"/>
-              <w:bottom w:w="80" w:type="dxa"/>
-              <w:right w:w="80" w:type="dxa"/>
-            </w:tcMar>
-          </w:tcPr>
-          <w:p>
-            <w:pPr>
-              <w:pStyle w:val="2"/>
-            </w:pPr>
-            <w:r>
-              <w:rPr>
-                <w:rFonts w:eastAsia="Arial Unicode MS" w:cs="Arial Unicode MS"/>
-              </w:rPr>
-              <w:t>Статус</w:t>
-            </w:r>
-          </w:p>
-        </w:tc>
-        <w:tc>
-          <w:tcPr>
-            <w:tcW w:w="3260" w:type="dxa"/>
-            <w:tcBorders>
-              <w:top w:val="single" w:sz="2" w:space="0" w:color="000000"/>
-              <w:left w:val="single" w:sz="2" w:space="0" w:color="000000"/>
-              <w:bottom w:val="single" w:sz="2" w:space="0" w:color="000000"/>
-              <w:right w:val="single" w:sz="2" w:space="0" w:color="000000"/>
-            </w:tcBorders>
-            <w:tcMar>
-              <w:top w:w="80" w:type="dxa"/>
-              <w:left w:w="80" w:type="dxa"/>
-              <w:bottom w:w="80" w:type="dxa"/>
-              <w:right w:w="80" w:type="dxa"/>
-            </w:tcMar>
-          </w:tcPr>
-          <w:p>
-            <w:pPr>
-              <w:pStyle w:val="2"/>
-            </w:pPr>
-            <w:r>
-              <w:rPr>
-                <w:rFonts w:eastAsia="Arial Unicode MS" w:cs="Arial Unicode MS"/>
-              </w:rPr>
-              <w:t>Описание</w:t>
-            </w:r>
-          </w:p>
-        </w:tc>
-        <w:tc>
-          <w:tcPr>
-            <w:tcW w:w="1559" w:type="dxa"/>
-            <w:tcBorders>
-              <w:top w:val="single" w:sz="2" w:space="0" w:color="000000"/>
-              <w:left w:val="single" w:sz="2" w:space="0" w:color="000000"/>
-              <w:bottom w:val="single" w:sz="2" w:space="0" w:color="000000"/>
-              <w:right w:val="single" w:sz="2" w:space="0" w:color="000000"/>
-            </w:tcBorders>
-            <w:tcMar>
-              <w:top w:w="80" w:type="dxa"/>
-              <w:left w:w="80" w:type="dxa"/>
-              <w:bottom w:w="80" w:type="dxa"/>
-              <w:right w:w="80" w:type="dxa"/>
-            </w:tcMar>
-          </w:tcPr>
-          <w:p>
-            <w:pPr>
-              <w:pStyle w:val="2"/>
-            </w:pPr>
-            <w:r>
-              <w:rPr>
-                <w:rFonts w:eastAsia="Arial Unicode MS" w:cs="Arial Unicode MS"/>
-              </w:rPr>
-              <w:t>Дата</w:t>
-            </w:r>
-          </w:p>
-        </w:tc>
-        <w:tc>
-          <w:tcPr>
-            <w:tcW w:w="1285" w:type="dxa"/>
-            <w:tcBorders>
-              <w:top w:val="single" w:sz="2" w:space="0" w:color="000000"/>
-              <w:left w:val="single" w:sz="2" w:space="0" w:color="000000"/>
-              <w:bottom w:val="single" w:sz="2" w:space="0" w:color="000000"/>
-              <w:right w:val="single" w:sz="2" w:space="0" w:color="000000"/>
-            </w:tcBorders>
-            <w:tcMar>
-              <w:top w:w="80" w:type="dxa"/>
-              <w:left w:w="80" w:type="dxa"/>
-              <w:bottom w:w="80" w:type="dxa"/>
-              <w:right w:w="80" w:type="dxa"/>
-            </w:tcMar>
-          </w:tcPr>
-          <w:p>
-            <w:pPr>
-              <w:pStyle w:val="2"/>
-            </w:pPr>
-            <w:r>
-              <w:rPr>
-                <w:rFonts w:eastAsia="Arial Unicode MS" w:cs="Arial Unicode MS"/>
-              </w:rPr>
-              <w:t>Время</w:t>
-            </w:r>
-          </w:p>
-        </w:tc>
-      </w:tr>
-      <w:tr>
-        <w:trPr>
-          <w:trHeight w:val="721"/>
-        </w:trPr>
-        <w:tc>
-          <w:tcPr>
-            <w:tcW w:w="567" w:type="dxa"/>
-            <w:tcBorders>
-              <w:top w:val="single" w:sz="2" w:space="0" w:color="000000"/>
-              <w:left w:val="single" w:sz="2" w:space="0" w:color="000000"/>
-              <w:bottom w:val="single" w:sz="2" w:space="0" w:color="000000"/>
-              <w:right w:val="single" w:sz="2" w:space="0" w:color="000000"/>
-            </w:tcBorders>
-            <w:shd w:val="clear" w:color="auto" w:fill="F5F5F5"/>
-            <w:tcMar>
-              <w:top w:w="80" w:type="dxa"/>
-              <w:left w:w="80" w:type="dxa"/>
-              <w:bottom w:w="80" w:type="dxa"/>
-              <w:right w:w="80" w:type="dxa"/>
-            </w:tcMar>
-          </w:tcPr>
-          <w:p>
-            <w:pPr>
-              <w:pStyle w:val="a4"/>
-              <w:jc w:val="center"/>
-            </w:pPr>
-            <w:proofErr w:type="gramStart"/>
-            <w:r>
-              <w:rPr>
-                <w:sz w:val="20"/>
-                <w:szCs w:val="20"/>
-              </w:rPr>
-              <w:t xml:space="preserve">{{ </w:t>
-            </w:r>
-            <w:proofErr w:type="spellStart"/>
-            <w:r>
-              <w:rPr>
-                <w:sz w:val="20"/>
-                <w:szCs w:val="20"/>
-                <w:lang w:val="en-US"/>
-              </w:rPr>
-              <w:t>idLog</w:t>
-            </w:r>
-            <w:proofErr w:type="spellEnd"/>
-            <w:proofErr w:type="gramEnd"/>
-            <w:r>
-              <w:rPr>
-                <w:sz w:val="20"/>
-                <w:szCs w:val="20"/>
-              </w:rPr>
-              <w:t xml:space="preserve"> }}</w:t>
-            </w:r>
-          </w:p>
-        </w:tc>
-        <w:tc>
-          <w:tcPr>
-            <w:tcW w:w="1985" w:type="dxa"/>
-            <w:tcBorders>
-              <w:top w:val="single" w:sz="2" w:space="0" w:color="000000"/>
-              <w:left w:val="single" w:sz="2" w:space="0" w:color="000000"/>
-              <w:bottom w:val="single" w:sz="2" w:space="0" w:color="000000"/>
-              <w:right w:val="single" w:sz="2" w:space="0" w:color="000000"/>
-            </w:tcBorders>
-            <w:shd w:val="clear" w:color="auto" w:fill="F5F5F5"/>
-            <w:tcMar>
-              <w:top w:w="80" w:type="dxa"/>
-              <w:left w:w="80" w:type="dxa"/>
-              <w:bottom w:w="80" w:type="dxa"/>
-              <w:right w:w="80" w:type="dxa"/>
-            </w:tcMar>
-          </w:tcPr>
-          <w:p>
-            <w:pPr>
-              <w:pStyle w:val="2"/>
-              <w:rPr>
-                <w:b/>
-                <w:bCs/>
-              </w:rPr>
-            </w:pPr>
-            <w:proofErr w:type="gramStart"/>
-            <w:r>
-              <w:rPr>
-                <w:rFonts w:eastAsia="Arial Unicode MS" w:cs="Arial Unicode MS"/>
-                <w:b/>
-                <w:bCs/>
-              </w:rPr>
-              <w:t xml:space="preserve">{{ </w:t>
-            </w:r>
-            <w:proofErr w:type="spellStart"/>
-            <w:r>
-              <w:rPr>
-                <w:rFonts w:eastAsia="Arial Unicode MS" w:cs="Arial Unicode MS"/>
-                <w:b/>
-                <w:bCs/>
-                <w:lang w:val="en-US"/>
-              </w:rPr>
-              <w:t>logC</w:t>
-            </w:r>
-            <w:r>
-              <w:rPr>
-                <w:rFonts w:eastAsia="Arial Unicode MS" w:cs="Arial Unicode MS"/>
-                <w:b/>
-                <w:bCs/>
-                <w:lang w:val="en-US"/>
-              </w:rPr>
-              <w:t>aption</w:t>
-            </w:r>
-            <w:proofErr w:type="spellEnd"/>
-            <w:proofErr w:type="gramEnd"/>
-            <w:r>
-              <w:rPr>
-                <w:rFonts w:eastAsia="Arial Unicode MS" w:cs="Arial Unicode MS"/>
-                <w:b/>
-                <w:bCs/>
-              </w:rPr>
-              <w:t xml:space="preserve"> }}</w:t>
-            </w:r>
-          </w:p>
-        </w:tc>
-        <w:tc>
-          <w:tcPr>
-            <w:tcW w:w="1559" w:type="dxa"/>
-            <w:tcBorders>
-              <w:top w:val="single" w:sz="2" w:space="0" w:color="000000"/>
-              <w:left w:val="single" w:sz="2" w:space="0" w:color="000000"/>
-              <w:bottom w:val="single" w:sz="2" w:space="0" w:color="000000"/>
-              <w:right w:val="single" w:sz="2" w:space="0" w:color="000000"/>
-            </w:tcBorders>
-            <w:shd w:val="clear" w:color="auto" w:fill="F5F5F5"/>
-            <w:tcMar>
-              <w:top w:w="80" w:type="dxa"/>
-              <w:left w:w="80" w:type="dxa"/>
-              <w:bottom w:w="80" w:type="dxa"/>
-              <w:right w:w="80" w:type="dxa"/>
-            </w:tcMar>
-          </w:tcPr>
-          <w:p>
-            <w:pPr>
-              <w:pStyle w:val="2"/>
-              <w:rPr>
-                <w:b/>
-                <w:bCs/>
-              </w:rPr>
-            </w:pPr>
-            <w:proofErr w:type="gramStart"/>
-            <w:r>
-              <w:rPr>
-                <w:rFonts w:eastAsia="Arial Unicode MS" w:cs="Arial Unicode MS"/>
-                <w:b/>
-                <w:bCs/>
-              </w:rPr>
-              <w:t xml:space="preserve">{{ </w:t>
-            </w:r>
-            <w:proofErr w:type="spellStart"/>
-            <w:r>
-              <w:rPr>
-                <w:rFonts w:eastAsia="Arial Unicode MS" w:cs="Arial Unicode MS"/>
-                <w:b/>
-                <w:bCs/>
-                <w:lang w:val="en-US"/>
-              </w:rPr>
-              <w:t>logType</w:t>
-            </w:r>
-            <w:proofErr w:type="spellEnd"/>
-            <w:proofErr w:type="gramEnd"/>
-            <w:r>
-              <w:rPr>
-                <w:rFonts w:eastAsia="Arial Unicode MS" w:cs="Arial Unicode MS"/>
-                <w:b/>
-                <w:bCs/>
-              </w:rPr>
-              <w:t xml:space="preserve"> }}</w:t>
-            </w:r>
-          </w:p>
-        </w:tc>
-        <w:tc>
-          <w:tcPr>
-            <w:tcW w:w="851" w:type="dxa"/>
-            <w:tcBorders>
-              <w:top w:val="single" w:sz="2" w:space="0" w:color="000000"/>
-              <w:left w:val="single" w:sz="2" w:space="0" w:color="000000"/>
-              <w:bottom w:val="single" w:sz="2" w:space="0" w:color="000000"/>
-              <w:right w:val="single" w:sz="2" w:space="0" w:color="000000"/>
-            </w:tcBorders>
-            <w:shd w:val="clear" w:color="auto" w:fill="F5F5F5"/>
-            <w:tcMar>
-              <w:top w:w="80" w:type="dxa"/>
-              <w:left w:w="80" w:type="dxa"/>
-              <w:bottom w:w="80" w:type="dxa"/>
-              <w:right w:w="80" w:type="dxa"/>
-            </w:tcMar>
-          </w:tcPr>
-          <w:p>
-            <w:pPr>
-              <w:pStyle w:val="2"/>
-              <w:rPr>
-                <w:b/>
-                <w:bCs/>
-                <w:lang w:val="en-US"/>
-              </w:rPr>
-            </w:pPr>
-            <w:r>
-              <w:rPr>
-                <w:b/>
-                <w:bCs/>
-                <w:lang w:val="en-US"/>
-              </w:rPr>
-              <w:t>{{</w:t>
-            </w:r>
-            <w:r>
-              <w:rPr>
-                <w:b/>
-                <w:bCs/>
-                <w:lang w:val="en-US"/>
-              </w:rPr>
-              <w:t xml:space="preserve"> </w:t>
-            </w:r>
-            <w:proofErr w:type="spellStart"/>
-            <w:r>
-              <w:rPr>
-                <w:b/>
-                <w:bCs/>
-                <w:lang w:val="en-US"/>
-              </w:rPr>
-              <w:t>logStatus</w:t>
-            </w:r>
-            <w:proofErr w:type="spellEnd"/>
-            <w:r>
-              <w:rPr>
-                <w:b/>
-                <w:bCs/>
-                <w:lang w:val="en-US"/>
-              </w:rPr>
-              <w:t xml:space="preserve"> </w:t>
-            </w:r>
-            <w:r>
-              <w:rPr>
-                <w:b/>
-                <w:bCs/>
-                <w:lang w:val="en-US"/>
-              </w:rPr>
-              <w:t>}}</w:t>
-            </w:r>
-          </w:p>
-        </w:tc>
-        <w:tc>
-          <w:tcPr>
-            <w:tcW w:w="3260" w:type="dxa"/>
-            <w:tcBorders>
-              <w:top w:val="single" w:sz="2" w:space="0" w:color="000000"/>
-              <w:left w:val="single" w:sz="2" w:space="0" w:color="000000"/>
-              <w:bottom w:val="single" w:sz="2" w:space="0" w:color="000000"/>
-              <w:right w:val="single" w:sz="2" w:space="0" w:color="000000"/>
-            </w:tcBorders>
-            <w:shd w:val="clear" w:color="auto" w:fill="F5F5F5"/>
-            <w:tcMar>
-              <w:top w:w="80" w:type="dxa"/>
-              <w:left w:w="80" w:type="dxa"/>
-              <w:bottom w:w="80" w:type="dxa"/>
-              <w:right w:w="80" w:type="dxa"/>
-            </w:tcMar>
-          </w:tcPr>
-          <w:p>
-            <w:pPr>
-              <w:pStyle w:val="2"/>
-              <w:rPr>
-                <w:b/>
-                <w:bCs/>
-              </w:rPr>
-            </w:pPr>
-            <w:proofErr w:type="gramStart"/>
-            <w:r>
-              <w:rPr>
-                <w:rFonts w:eastAsia="Arial Unicode MS" w:cs="Arial Unicode MS"/>
-                <w:b/>
-                <w:bCs/>
-              </w:rPr>
-              <w:t xml:space="preserve">{{ </w:t>
-            </w:r>
-            <w:proofErr w:type="spellStart"/>
-            <w:r>
-              <w:rPr>
-                <w:rFonts w:eastAsia="Arial Unicode MS" w:cs="Arial Unicode MS"/>
-                <w:b/>
-                <w:bCs/>
-                <w:lang w:val="en-US"/>
-              </w:rPr>
-              <w:t>logD</w:t>
-            </w:r>
-            <w:r>
-              <w:rPr>
-                <w:rFonts w:eastAsia="Arial Unicode MS" w:cs="Arial Unicode MS"/>
-                <w:b/>
-                <w:bCs/>
-                <w:lang w:val="en-US"/>
-              </w:rPr>
-              <w:t>escr</w:t>
-            </w:r>
-            <w:proofErr w:type="spellEnd"/>
-            <w:proofErr w:type="gramEnd"/>
-            <w:r>
-              <w:rPr>
-                <w:rFonts w:eastAsia="Arial Unicode MS" w:cs="Arial Unicode MS"/>
-                <w:b/>
-                <w:bCs/>
-              </w:rPr>
-              <w:t xml:space="preserve"> }}</w:t>
-            </w:r>
-          </w:p>
-        </w:tc>
-        <w:tc>
-          <w:tcPr>
-            <w:tcW w:w="1559" w:type="dxa"/>
-            <w:tcBorders>
-              <w:top w:val="single" w:sz="2" w:space="0" w:color="000000"/>
-              <w:left w:val="single" w:sz="2" w:space="0" w:color="000000"/>
-              <w:bottom w:val="single" w:sz="2" w:space="0" w:color="000000"/>
-              <w:right w:val="single" w:sz="2" w:space="0" w:color="000000"/>
-            </w:tcBorders>
-            <w:shd w:val="clear" w:color="auto" w:fill="F5F5F5"/>
-            <w:tcMar>
-              <w:top w:w="80" w:type="dxa"/>
-              <w:left w:w="80" w:type="dxa"/>
-              <w:bottom w:w="80" w:type="dxa"/>
-              <w:right w:w="80" w:type="dxa"/>
-            </w:tcMar>
-          </w:tcPr>
-          <w:p>
-            <w:pPr>
-              <w:pStyle w:val="2"/>
-              <w:rPr>
-                <w:b/>
-                <w:bCs/>
-              </w:rPr>
-            </w:pPr>
-            <w:proofErr w:type="gramStart"/>
-            <w:r>
-              <w:rPr>
-                <w:rFonts w:eastAsia="Arial Unicode MS" w:cs="Arial Unicode MS"/>
-                <w:b/>
-                <w:bCs/>
-              </w:rPr>
-              <w:t xml:space="preserve">{{ </w:t>
-            </w:r>
-            <w:proofErr w:type="spellStart"/>
-            <w:r>
-              <w:rPr>
-                <w:rFonts w:eastAsia="Arial Unicode MS" w:cs="Arial Unicode MS"/>
-                <w:b/>
-                <w:bCs/>
-                <w:lang w:val="en-US"/>
-              </w:rPr>
-              <w:t>logDate</w:t>
-            </w:r>
-            <w:proofErr w:type="spellEnd"/>
-            <w:proofErr w:type="gramEnd"/>
-            <w:r>
-              <w:rPr>
-                <w:rFonts w:eastAsia="Arial Unicode MS" w:cs="Arial Unicode MS"/>
-                <w:b/>
-                <w:bCs/>
-              </w:rPr>
-              <w:t xml:space="preserve"> }}</w:t>
-            </w:r>
-          </w:p>
-        </w:tc>
-        <w:tc>
-          <w:tcPr>
-            <w:tcW w:w="1285" w:type="dxa"/>
-            <w:tcBorders>
-              <w:top w:val="single" w:sz="2" w:space="0" w:color="000000"/>
-              <w:left w:val="single" w:sz="2" w:space="0" w:color="000000"/>
-              <w:bottom w:val="single" w:sz="2" w:space="0" w:color="000000"/>
-              <w:right w:val="single" w:sz="2" w:space="0" w:color="000000"/>
-            </w:tcBorders>
-            <w:shd w:val="clear" w:color="auto" w:fill="F5F5F5"/>
-            <w:tcMar>
-              <w:top w:w="80" w:type="dxa"/>
-              <w:left w:w="80" w:type="dxa"/>
-              <w:bottom w:w="80" w:type="dxa"/>
-              <w:right w:w="80" w:type="dxa"/>
-            </w:tcMar>
-          </w:tcPr>
-          <w:p>
-            <w:pPr>
-              <w:rPr>
-                <w:b/>
-                <w:bCs/>
-              </w:rPr>
-            </w:pPr>
-            <w:r>
-              <w:rPr>
-                <w:rFonts w:ascii="Helvetica Neue" w:hAnsi="Helvetica Neue" w:cs="Arial Unicode MS"/>
-                <w:b/>
-                <w:bCs/>
-                <w:color w:val="000000"/>
-                <w:sz w:val="20"/>
-                <w:szCs w:val="20"/>
-                <w14:textOutline w14:w="0" w14:cap="flat" w14:cmpd="sng" w14:algn="ctr">
-                  <w14:noFill/>
-                  <w14:prstDash w14:val="solid"/>
-                  <w14:bevel/>
-                </w14:textOutline>
-              </w:rPr>
-              <w:t xml:space="preserve">{{ </w:t>
-            </w:r>
-            <w:proofErr w:type="spellStart"/>
-            <w:r>
-              <w:rPr>
-                <w:rFonts w:ascii="Helvetica Neue" w:hAnsi="Helvetica Neue" w:cs="Arial Unicode MS"/>
-                <w:b/>
-                <w:bCs/>
-                <w:color w:val="000000"/>
-                <w:sz w:val="20"/>
-                <w:szCs w:val="20"/>
-                <w14:textOutline w14:w="0" w14:cap="flat" w14:cmpd="sng" w14:algn="ctr">
-                  <w14:noFill/>
-                  <w14:prstDash w14:val="solid"/>
-                  <w14:bevel/>
-                </w14:textOutline>
-              </w:rPr>
-              <w:t>logTime</w:t>
-            </w:r>
-            <w:proofErr w:type="spellEnd"/>
-            <w:r>
-              <w:rPr>
-                <w:rFonts w:ascii="Helvetica Neue" w:hAnsi="Helvetica Neue" w:cs="Arial Unicode MS"/>
-                <w:b/>
-                <w:bCs/>
-                <w:color w:val="000000"/>
-                <w:sz w:val="20"/>
-                <w:szCs w:val="20"/>
-                <w14:textOutline w14:w="0" w14:cap="flat" w14:cmpd="sng" w14:algn="ctr">
-                  <w14:noFill/>
-                  <w14:prstDash w14:val="solid"/>
-                  <w14:bevel/>
-                </w14:textOutline>
-              </w:rPr>
-              <w:t xml:space="preserve"> }}</w:t>
-            </w:r>
-          </w:p>
-        </w:tc>
-      </w:tr>
-    </w:tbl>
-    <w:p>
-      <w:pPr>
-        <w:pStyle w:val="a5"/>
-        <w:rPr>
-          <w:rFonts w:ascii="Times New Roman" w:hAnsi="Times New Roman" w:cs="Times New Roman"/>
-          <w:sz w:val="36"/>
-          <w:szCs w:val="36"/>
-          <w:lang w:val="en-US"/>
-        </w:rPr>
-      </w:pPr>
     </w:p>
     <w:p>
       <w:pPr>

</xml_diff>